<commit_message>
Updated word doc containing ITR0
</commit_message>
<xml_diff>
--- a/ITR0_FILES/ITR0_PDF_DOCUMENT.docx
+++ b/ITR0_FILES/ITR0_PDF_DOCUMENT.docx
@@ -434,6 +434,180 @@
       <w:r>
         <w:t xml:space="preserve"> </w:t>
       </w:r>
+    </w:p>
+    <w:p>
+      <w:proofErr w:type="spellStart"/>
+      <w:r>
+        <w:t>StoreFlow</w:t>
+      </w:r>
+      <w:proofErr w:type="spellEnd"/>
+      <w:r>
+        <w:t xml:space="preserve"> Analytics Vision Statement</w:t>
+      </w:r>
+    </w:p>
+    <w:p>
+      <w:r>
+        <w:t>The S</w:t>
+      </w:r>
+      <w:proofErr w:type="spellStart"/>
+      <w:r>
+        <w:t>toreFlow</w:t>
+      </w:r>
+      <w:proofErr w:type="spellEnd"/>
+      <w:r>
+        <w:t xml:space="preserve"> Analytics System will be used by independent grocery store owners and managers to measure in-store customer traffic, movement, and purchasing outcomes so they can understand conversion rates, evaluate </w:t>
+      </w:r>
+      <w:r>
+        <w:t>product advertising</w:t>
+      </w:r>
+      <w:r>
+        <w:t>, and improve store operations.</w:t>
+      </w:r>
+      <w:r>
+        <w:t xml:space="preserve"> </w:t>
+      </w:r>
+      <w:r>
+        <w:t>The system combines overhead camera-based path tracking with point-of-sale (POS) sales data to produce actionable reports</w:t>
+      </w:r>
+      <w:r>
+        <w:t xml:space="preserve"> </w:t>
+      </w:r>
+      <w:r>
+        <w:t>while operating locally and using anonymized, aggregate data.</w:t>
+      </w:r>
+    </w:p>
+    <w:p>
+      <w:r>
+        <w:t>The system is designed for brick-and-mortar grocery retailers</w:t>
+      </w:r>
+      <w:r>
+        <w:t xml:space="preserve"> </w:t>
+      </w:r>
+      <w:r>
+        <w:t>who want to answer practical questions such as: How many people enter the store? How many end up purchasing? Where do customers spend time? Do endcaps or shelf promotions affect purchasing? Where do bottlenecks form (aisles, sampling stands, checkout lines)? Store owners and managers are the primary users, since they make decisions about layout, staffing, and merchandising. Secondary users may include store supervisors who review daily/weekly performance and staff schedulers who adjust coverage based on peak traffic and observed wait times.</w:t>
+      </w:r>
+    </w:p>
+    <w:p>
+      <w:proofErr w:type="spellStart"/>
+      <w:r>
+        <w:t>StoreFlow</w:t>
+      </w:r>
+      <w:proofErr w:type="spellEnd"/>
+      <w:r>
+        <w:t xml:space="preserve"> Analytics will provide three core capabilities. First, it will support a virtual 2D store layout that represents the physical store, allowing staff to label key zones such as aisles, shelves, promotional displays, sampling stands, and checkout areas. This map will be aligned with the camera feeds so that activity observed in video corresponds to specific locations on the layout.</w:t>
+      </w:r>
+    </w:p>
+    <w:p>
+      <w:r>
+        <w:t>Second, the system will perform in-store tracking to estimate customer counts and movement paths through the store, including where customers stop, dwell, or queue. The system will integrate these movement signals with sales outcomes by linking storewide traffic patterns with POS data collected at checkout. This will enable the store to compare observed behavior (e.g., visiting a promotional display) with outcomes (e.g., purchasing the promoted item), and to identify patterns like high-traffic low-conversion zones or recurring congestion points.</w:t>
+      </w:r>
+    </w:p>
+    <w:p>
+      <w:r>
+        <w:t>Third, the system will transform collected signals into actionable business insights</w:t>
+      </w:r>
+      <w:r>
+        <w:t xml:space="preserve"> </w:t>
+      </w:r>
+      <w:r>
+        <w:t>through reports and summaries. These insights will include conversion-focused measures (traffic vs. purchases), promotion effectiveness (exposure vs. purchase), operational metrics (checkout wait times, peak periods), and layout/flow indicators (crowding and bottlenecks). The goal is to help retailers adjust staffing schedules, refine product placement, and improve customer flow in ways that increase sales without increasing customer frustration.</w:t>
+      </w:r>
+    </w:p>
+    <w:p/>
+    <w:p>
+      <w:r>
+        <w:t>Because the system handles customer movement in a physical store, privacy and compliance are central to the vision</w:t>
+      </w:r>
+      <w:r>
+        <w:t>.</w:t>
+      </w:r>
+      <w:r>
+        <w:t xml:space="preserve"> </w:t>
+      </w:r>
+      <w:proofErr w:type="spellStart"/>
+      <w:r>
+        <w:t>StoreFlow</w:t>
+      </w:r>
+      <w:proofErr w:type="spellEnd"/>
+      <w:r>
+        <w:t xml:space="preserve"> Analytics will be designed to avoid storing identifiable personal information. It will not maintain persistent profiles of individuals across visits, and its outputs will be presented as aggregated statistics and trends rather than person-level histories. Processing will be performed locally on a store-controlled machine rather than relying on cloud services, reducing recurring infrastructure costs and keeping sensitive data under the retailer’s control.</w:t>
+      </w:r>
+    </w:p>
+    <w:p>
+      <w:r>
+        <w:t xml:space="preserve">This project is valuable because many independent grocers lack practical tools to measure conversion rates and in-store </w:t>
+      </w:r>
+      <w:proofErr w:type="gramStart"/>
+      <w:r>
+        <w:t>behavior, and</w:t>
+      </w:r>
+      <w:proofErr w:type="gramEnd"/>
+      <w:r>
+        <w:t xml:space="preserve"> therefore must make costly merchandising and staffing decisions with limited evidence. By using existing or upgraded security-camera infrastructure and producing clear operational metrics, </w:t>
+      </w:r>
+      <w:proofErr w:type="spellStart"/>
+      <w:r>
+        <w:t>StoreFlow</w:t>
+      </w:r>
+      <w:proofErr w:type="spellEnd"/>
+      <w:r>
+        <w:t xml:space="preserve"> Analytics will help retailers understand what drives purchasing, identify friction points, and justify changes with data rather than guesswork.</w:t>
+      </w:r>
+    </w:p>
+    <w:p>
+      <w:r>
+        <w:t>The project will be considered successful based on the following criteria. First, the store owner can use the system to obtain a</w:t>
+      </w:r>
+      <w:r>
+        <w:t xml:space="preserve"> </w:t>
+      </w:r>
+      <w:r>
+        <w:t>clear conversion estimate (visitors vs. purchasers) over selected time periods. Second, the system can produce interpretable reports that allow the owner to make at least one concrete decision</w:t>
+      </w:r>
+      <w:r>
+        <w:t xml:space="preserve"> </w:t>
+      </w:r>
+      <w:r>
+        <w:t>such as adjusting staffing coverage for peak checkout times or modifying a</w:t>
+      </w:r>
+      <w:r>
+        <w:t xml:space="preserve"> product advertisement </w:t>
+      </w:r>
+      <w:r>
+        <w:t xml:space="preserve">placement. Third, the system demonstrates practical </w:t>
+      </w:r>
+      <w:proofErr w:type="spellStart"/>
+      <w:r>
+        <w:t>deployability</w:t>
+      </w:r>
+      <w:proofErr w:type="spellEnd"/>
+      <w:r>
+        <w:t xml:space="preserve"> for an independent grocer by running locally, leveraging store infrastructure, and presenting results in a way the owner finds useful and credible. If these criteria are met and the customer indicates they would prefer using this approach over their current </w:t>
+      </w:r>
+      <w:r>
+        <w:t>guesswork</w:t>
+      </w:r>
+      <w:r>
+        <w:t xml:space="preserve"> process for layout, promotions, and scheduling, the system will be considered a success.</w:t>
+      </w:r>
+      <w:r>
+        <w:br w:type="page"/>
+      </w:r>
+    </w:p>
+    <w:p>
+      <w:pPr>
+        <w:rPr>
+          <w:rFonts w:asciiTheme="majorHAnsi" w:eastAsiaTheme="majorEastAsia" w:hAnsiTheme="majorHAnsi" w:cstheme="majorBidi"/>
+          <w:color w:val="0F4761" w:themeColor="accent1" w:themeShade="BF"/>
+          <w:sz w:val="32"/>
+          <w:szCs w:val="32"/>
+        </w:rPr>
+      </w:pPr>
+    </w:p>
+    <w:p>
+      <w:pPr>
+        <w:pStyle w:val="Heading2"/>
+      </w:pPr>
     </w:p>
     <w:p>
       <w:pPr>

</xml_diff>

<commit_message>
Updated itr0 document to submit
</commit_message>
<xml_diff>
--- a/ITR0_FILES/ITR0_PDF_DOCUMENT.docx
+++ b/ITR0_FILES/ITR0_PDF_DOCUMENT.docx
@@ -6,12 +6,12 @@
       <w:pPr>
         <w:pStyle w:val="Heading1"/>
       </w:pPr>
-      <w:bookmarkStart w:name="_Toc1948109811" w:id="73129642"/>
+      <w:bookmarkStart w:name="_Toc904983406" w:id="790307052"/>
       <w:r>
         <w:rPr/>
         <w:t>ITR0 Document</w:t>
       </w:r>
-      <w:bookmarkEnd w:id="73129642"/>
+      <w:bookmarkEnd w:id="790307052"/>
     </w:p>
     <w:p/>
     <w:p>
@@ -21,7 +21,7 @@
     </w:p>
     <w:sdt>
       <w:sdtPr>
-        <w:id w:val="861284868"/>
+        <w:id w:val="983240028"/>
         <w:docPartObj>
           <w:docPartGallery w:val="Table of Contents"/>
           <w:docPartUnique/>
@@ -57,7 +57,7 @@
           <w:r>
             <w:fldChar w:fldCharType="separate"/>
           </w:r>
-          <w:hyperlink w:anchor="_Toc1948109811">
+          <w:hyperlink w:anchor="_Toc904983406">
             <w:r>
               <w:rPr>
                 <w:rStyle w:val="Hyperlink"/>
@@ -71,7 +71,7 @@
               <w:fldChar w:fldCharType="begin"/>
             </w:r>
             <w:r>
-              <w:instrText xml:space="preserve">PAGEREF _Toc1948109811 \h</w:instrText>
+              <w:instrText xml:space="preserve">PAGEREF _Toc904983406 \h</w:instrText>
             </w:r>
             <w:r>
               <w:fldChar w:fldCharType="separate"/>
@@ -98,7 +98,7 @@
               <w:noProof/>
             </w:rPr>
           </w:pPr>
-          <w:hyperlink w:anchor="_Toc1474477647">
+          <w:hyperlink w:anchor="_Toc581659075">
             <w:r>
               <w:rPr>
                 <w:rStyle w:val="Hyperlink"/>
@@ -112,7 +112,7 @@
               <w:fldChar w:fldCharType="begin"/>
             </w:r>
             <w:r>
-              <w:instrText xml:space="preserve">PAGEREF _Toc1474477647 \h</w:instrText>
+              <w:instrText xml:space="preserve">PAGEREF _Toc581659075 \h</w:instrText>
             </w:r>
             <w:r>
               <w:fldChar w:fldCharType="separate"/>
@@ -139,7 +139,7 @@
               <w:noProof/>
             </w:rPr>
           </w:pPr>
-          <w:hyperlink w:anchor="_Toc1042739034">
+          <w:hyperlink w:anchor="_Toc1981364169">
             <w:r>
               <w:rPr>
                 <w:rStyle w:val="Hyperlink"/>
@@ -153,7 +153,7 @@
               <w:fldChar w:fldCharType="begin"/>
             </w:r>
             <w:r>
-              <w:instrText xml:space="preserve">PAGEREF _Toc1042739034 \h</w:instrText>
+              <w:instrText xml:space="preserve">PAGEREF _Toc1981364169 \h</w:instrText>
             </w:r>
             <w:r>
               <w:fldChar w:fldCharType="separate"/>
@@ -180,7 +180,7 @@
               <w:noProof/>
             </w:rPr>
           </w:pPr>
-          <w:hyperlink w:anchor="_Toc264726923">
+          <w:hyperlink w:anchor="_Toc1588381319">
             <w:r>
               <w:rPr>
                 <w:rStyle w:val="Hyperlink"/>
@@ -194,7 +194,7 @@
               <w:fldChar w:fldCharType="begin"/>
             </w:r>
             <w:r>
-              <w:instrText xml:space="preserve">PAGEREF _Toc264726923 \h</w:instrText>
+              <w:instrText xml:space="preserve">PAGEREF _Toc1588381319 \h</w:instrText>
             </w:r>
             <w:r>
               <w:fldChar w:fldCharType="separate"/>
@@ -221,7 +221,47 @@
               <w:noProof/>
             </w:rPr>
           </w:pPr>
-          <w:hyperlink w:anchor="_Toc852482183">
+          <w:hyperlink w:anchor="_Toc694112545">
+            <w:r>
+              <w:rPr>
+                <w:rStyle w:val="Hyperlink"/>
+              </w:rPr>
+              <w:t>Story Mapping</w:t>
+            </w:r>
+            <w:r>
+              <w:tab/>
+            </w:r>
+            <w:r>
+              <w:fldChar w:fldCharType="begin"/>
+            </w:r>
+            <w:r>
+              <w:instrText xml:space="preserve">PAGEREF _Toc694112545 \h</w:instrText>
+            </w:r>
+            <w:r>
+              <w:fldChar w:fldCharType="separate"/>
+            </w:r>
+            <w:r>
+              <w:rPr>
+                <w:rStyle w:val="Hyperlink"/>
+              </w:rPr>
+              <w:t>7</w:t>
+            </w:r>
+            <w:r>
+              <w:fldChar w:fldCharType="end"/>
+            </w:r>
+          </w:hyperlink>
+        </w:p>
+        <w:p>
+          <w:pPr>
+            <w:pStyle w:val="TOC2"/>
+            <w:tabs>
+              <w:tab w:val="right" w:leader="dot" w:pos="9345"/>
+            </w:tabs>
+            <w:rPr>
+              <w:rStyle w:val="Hyperlink"/>
+            </w:rPr>
+          </w:pPr>
+          <w:hyperlink w:anchor="_Toc277381240">
             <w:r>
               <w:rPr>
                 <w:rStyle w:val="Hyperlink"/>
@@ -235,7 +275,7 @@
               <w:fldChar w:fldCharType="begin"/>
             </w:r>
             <w:r>
-              <w:instrText xml:space="preserve">PAGEREF _Toc852482183 \h</w:instrText>
+              <w:instrText xml:space="preserve">PAGEREF _Toc277381240 \h</w:instrText>
             </w:r>
             <w:r>
               <w:fldChar w:fldCharType="separate"/>
@@ -266,12 +306,12 @@
       <w:pPr>
         <w:pStyle w:val="Heading2"/>
       </w:pPr>
-      <w:bookmarkStart w:name="_Toc1474477647" w:id="1158290733"/>
+      <w:bookmarkStart w:name="_Toc581659075" w:id="2018845050"/>
       <w:r>
         <w:rPr/>
         <w:t>Vision Statement</w:t>
       </w:r>
-      <w:bookmarkEnd w:id="1158290733"/>
+      <w:bookmarkEnd w:id="2018845050"/>
       <w:r>
         <w:rPr/>
         <w:t xml:space="preserve"> </w:t>
@@ -389,12 +429,12 @@
       <w:pPr>
         <w:pStyle w:val="Heading2"/>
       </w:pPr>
-      <w:bookmarkStart w:name="_Toc1042739034" w:id="1956673567"/>
+      <w:bookmarkStart w:name="_Toc1981364169" w:id="972889008"/>
       <w:r>
         <w:rPr/>
         <w:t>Big User Stories</w:t>
       </w:r>
-      <w:bookmarkEnd w:id="1956673567"/>
+      <w:bookmarkEnd w:id="972889008"/>
     </w:p>
     <w:p>
       <w:pPr>
@@ -587,23 +627,28 @@
       <w:pPr>
         <w:pStyle w:val="Heading2"/>
       </w:pPr>
-      <w:bookmarkStart w:name="_Toc264726923" w:id="2125374475"/>
+      <w:bookmarkStart w:name="_Toc1588381319" w:id="1289933727"/>
       <w:r>
         <w:rPr/>
         <w:t>Detailed User Stories for Itr1</w:t>
       </w:r>
-      <w:bookmarkEnd w:id="2125374475"/>
+      <w:bookmarkEnd w:id="1289933727"/>
     </w:p>
     <w:p>
       <w:pPr>
         <w:pStyle w:val="Normal"/>
       </w:pPr>
+    </w:p>
+    <w:p>
+      <w:pPr>
+        <w:pStyle w:val="Normal"/>
+      </w:pPr>
       <w:r>
         <w:drawing>
-          <wp:inline wp14:editId="77757751" wp14:anchorId="3A999896">
-            <wp:extent cx="5943600" cy="3657632"/>
+          <wp:inline wp14:editId="0E348577" wp14:anchorId="0B94917E">
+            <wp:extent cx="5943600" cy="3571910"/>
             <wp:effectExtent l="0" t="0" r="0" b="0"/>
-            <wp:docPr id="1897300205" name="drawing"/>
+            <wp:docPr id="202341567" name="drawing"/>
             <wp:cNvGraphicFramePr>
               <a:graphicFrameLocks noChangeAspect="1"/>
             </wp:cNvGraphicFramePr>
@@ -611,18 +656,18 @@
               <a:graphicData xmlns:a="http://schemas.openxmlformats.org/drawingml/2006/main" uri="http://schemas.openxmlformats.org/drawingml/2006/picture">
                 <pic:pic xmlns:pic="http://schemas.openxmlformats.org/drawingml/2006/picture">
                   <pic:nvPicPr>
-                    <pic:cNvPr id="1897300205" name="Picture 1897300205"/>
+                    <pic:cNvPr id="202341567" name=""/>
                     <pic:cNvPicPr/>
                   </pic:nvPicPr>
                   <pic:blipFill>
-                    <a:blip xmlns:r="http://schemas.openxmlformats.org/officeDocument/2006/relationships" r:embed="rId817350909">
+                    <a:blip xmlns:r="http://schemas.openxmlformats.org/officeDocument/2006/relationships" r:embed="rId416049812">
                       <a:extLst>
                         <a:ext uri="{28A0092B-C50C-407E-A947-70E740481C1C}">
                           <a14:useLocalDpi xmlns:a14="http://schemas.microsoft.com/office/drawing/2010/main"/>
                         </a:ext>
                       </a:extLst>
                     </a:blip>
-                    <a:srcRect l="0" t="0" r="0" b="17948"/>
+                    <a:srcRect l="0" t="0" r="0" b="19871"/>
                     <a:stretch>
                       <a:fillRect/>
                     </a:stretch>
@@ -630,7 +675,7 @@
                   <pic:spPr>
                     <a:xfrm rot="0">
                       <a:off x="0" y="0"/>
-                      <a:ext cx="5943600" cy="3657632"/>
+                      <a:ext cx="5943600" cy="3571910"/>
                     </a:xfrm>
                     <a:prstGeom prst="rect">
                       <a:avLst/>
@@ -642,9 +687,14 @@
           </wp:inline>
         </w:drawing>
       </w:r>
+    </w:p>
+    <w:p>
+      <w:pPr>
+        <w:pStyle w:val="Normal"/>
+      </w:pPr>
       <w:r>
         <w:drawing>
-          <wp:inline wp14:editId="657207D7" wp14:anchorId="3A4D8F38">
+          <wp:inline wp14:editId="58FF8142" wp14:anchorId="3A4D8F38">
             <wp:extent cx="5943600" cy="3676666"/>
             <wp:effectExtent l="0" t="0" r="0" b="0"/>
             <wp:docPr id="1705439526" name="drawing"/>
@@ -688,7 +738,7 @@
       </w:r>
       <w:r>
         <w:drawing>
-          <wp:inline wp14:editId="6D8492CA" wp14:anchorId="60301C92">
+          <wp:inline wp14:editId="7DF9F017" wp14:anchorId="60301C92">
             <wp:extent cx="5943600" cy="3593129"/>
             <wp:effectExtent l="0" t="0" r="0" b="0"/>
             <wp:docPr id="20687142" name="drawing"/>
@@ -732,7 +782,7 @@
       </w:r>
       <w:r>
         <w:drawing>
-          <wp:inline wp14:editId="6BBBEC83" wp14:anchorId="5F897B81">
+          <wp:inline wp14:editId="22A1A85F" wp14:anchorId="5F897B81">
             <wp:extent cx="5943600" cy="3648093"/>
             <wp:effectExtent l="0" t="0" r="0" b="0"/>
             <wp:docPr id="466953457" name="drawing"/>
@@ -776,7 +826,7 @@
       </w:r>
       <w:r>
         <w:drawing>
-          <wp:inline wp14:editId="414B3412" wp14:anchorId="5620D186">
+          <wp:inline wp14:editId="7F632205" wp14:anchorId="5620D186">
             <wp:extent cx="5943600" cy="3636190"/>
             <wp:effectExtent l="0" t="0" r="0" b="0"/>
             <wp:docPr id="505872902" name="drawing"/>
@@ -823,12 +873,323 @@
       <w:pPr>
         <w:pStyle w:val="Heading2"/>
       </w:pPr>
-      <w:bookmarkStart w:name="_Toc852482183" w:id="1173891091"/>
+    </w:p>
+    <w:p>
+      <w:pPr/>
+      <w:r>
+        <w:br w:type="page"/>
+      </w:r>
+    </w:p>
+    <w:p>
+      <w:pPr>
+        <w:pStyle w:val="Heading2"/>
+      </w:pPr>
+      <w:bookmarkStart w:name="_Toc694112545" w:id="1802377492"/>
+      <w:r>
+        <w:rPr/>
+        <w:t>Story Mapping</w:t>
+      </w:r>
+      <w:bookmarkEnd w:id="1802377492"/>
+    </w:p>
+    <w:p>
+      <w:pPr>
+        <w:pStyle w:val="ListParagraph"/>
+        <w:numPr>
+          <w:ilvl w:val="0"/>
+          <w:numId w:val="1"/>
+        </w:numPr>
+        <w:rPr/>
+      </w:pPr>
+      <w:r>
+        <w:rPr/>
+        <w:t>Big Stories</w:t>
+      </w:r>
+    </w:p>
+    <w:p>
+      <w:pPr>
+        <w:pStyle w:val="ListParagraph"/>
+        <w:numPr>
+          <w:ilvl w:val="1"/>
+          <w:numId w:val="1"/>
+        </w:numPr>
+        <w:rPr/>
+      </w:pPr>
+      <w:r>
+        <w:rPr/>
+        <w:t>Store Layout/Mapping</w:t>
+      </w:r>
+    </w:p>
+    <w:p>
+      <w:pPr>
+        <w:pStyle w:val="ListParagraph"/>
+        <w:numPr>
+          <w:ilvl w:val="2"/>
+          <w:numId w:val="1"/>
+        </w:numPr>
+        <w:rPr/>
+      </w:pPr>
+      <w:r>
+        <w:rPr/>
+        <w:t>IT1</w:t>
+      </w:r>
+    </w:p>
+    <w:p>
+      <w:pPr>
+        <w:pStyle w:val="ListParagraph"/>
+        <w:numPr>
+          <w:ilvl w:val="1"/>
+          <w:numId w:val="1"/>
+        </w:numPr>
+        <w:rPr/>
+      </w:pPr>
+      <w:r>
+        <w:rPr/>
+        <w:t>Analytics and Actionable Insights</w:t>
+      </w:r>
+    </w:p>
+    <w:p>
+      <w:pPr>
+        <w:pStyle w:val="ListParagraph"/>
+        <w:numPr>
+          <w:ilvl w:val="2"/>
+          <w:numId w:val="1"/>
+        </w:numPr>
+        <w:rPr/>
+      </w:pPr>
+      <w:r>
+        <w:rPr/>
+        <w:t>IT2</w:t>
+      </w:r>
+    </w:p>
+    <w:p>
+      <w:pPr>
+        <w:pStyle w:val="ListParagraph"/>
+        <w:numPr>
+          <w:ilvl w:val="1"/>
+          <w:numId w:val="1"/>
+        </w:numPr>
+        <w:rPr/>
+      </w:pPr>
+      <w:r>
+        <w:rPr/>
+        <w:t>Sales and Behavior Data Integration</w:t>
+      </w:r>
+    </w:p>
+    <w:p>
+      <w:pPr>
+        <w:pStyle w:val="ListParagraph"/>
+        <w:numPr>
+          <w:ilvl w:val="2"/>
+          <w:numId w:val="1"/>
+        </w:numPr>
+        <w:rPr/>
+      </w:pPr>
+      <w:r>
+        <w:rPr/>
+        <w:t>ITR3</w:t>
+      </w:r>
+    </w:p>
+    <w:p>
+      <w:pPr>
+        <w:pStyle w:val="ListParagraph"/>
+        <w:numPr>
+          <w:ilvl w:val="1"/>
+          <w:numId w:val="1"/>
+        </w:numPr>
+        <w:rPr/>
+      </w:pPr>
+      <w:r>
+        <w:rPr/>
+        <w:t>Customer Movement/Path Tracking</w:t>
+      </w:r>
+    </w:p>
+    <w:p>
+      <w:pPr>
+        <w:pStyle w:val="ListParagraph"/>
+        <w:numPr>
+          <w:ilvl w:val="2"/>
+          <w:numId w:val="1"/>
+        </w:numPr>
+        <w:rPr/>
+      </w:pPr>
+      <w:r>
+        <w:rPr/>
+        <w:t>IT4</w:t>
+      </w:r>
+    </w:p>
+    <w:p>
+      <w:pPr>
+        <w:pStyle w:val="ListParagraph"/>
+        <w:numPr>
+          <w:ilvl w:val="0"/>
+          <w:numId w:val="1"/>
+        </w:numPr>
+        <w:rPr/>
+      </w:pPr>
+      <w:r>
+        <w:rPr/>
+        <w:t>Detailed User Stories</w:t>
+      </w:r>
+      <w:r>
+        <w:rPr/>
+        <w:t xml:space="preserve"> (ITR1)</w:t>
+      </w:r>
+    </w:p>
+    <w:p>
+      <w:pPr>
+        <w:pStyle w:val="ListParagraph"/>
+        <w:numPr>
+          <w:ilvl w:val="1"/>
+          <w:numId w:val="1"/>
+        </w:numPr>
+        <w:rPr/>
+      </w:pPr>
+      <w:r>
+        <w:rPr/>
+        <w:t>Compiled Binaries for Windows (X86)</w:t>
+      </w:r>
+    </w:p>
+    <w:p>
+      <w:pPr>
+        <w:pStyle w:val="ListParagraph"/>
+        <w:numPr>
+          <w:ilvl w:val="2"/>
+          <w:numId w:val="1"/>
+        </w:numPr>
+        <w:rPr/>
+      </w:pPr>
+      <w:r>
+        <w:rPr/>
+        <w:t>Ryan</w:t>
+      </w:r>
+    </w:p>
+    <w:p>
+      <w:pPr>
+        <w:pStyle w:val="ListParagraph"/>
+        <w:numPr>
+          <w:ilvl w:val="1"/>
+          <w:numId w:val="1"/>
+        </w:numPr>
+        <w:rPr/>
+      </w:pPr>
+      <w:r>
+        <w:rPr/>
+        <w:t>Mock Sales Database</w:t>
+      </w:r>
+    </w:p>
+    <w:p>
+      <w:pPr>
+        <w:pStyle w:val="ListParagraph"/>
+        <w:numPr>
+          <w:ilvl w:val="2"/>
+          <w:numId w:val="1"/>
+        </w:numPr>
+        <w:rPr/>
+      </w:pPr>
+      <w:r>
+        <w:rPr/>
+        <w:t>Mani</w:t>
+      </w:r>
+    </w:p>
+    <w:p>
+      <w:pPr>
+        <w:pStyle w:val="ListParagraph"/>
+        <w:numPr>
+          <w:ilvl w:val="1"/>
+          <w:numId w:val="1"/>
+        </w:numPr>
+        <w:rPr/>
+      </w:pPr>
+      <w:r>
+        <w:rPr/>
+        <w:t>Wiki/ReadMe</w:t>
+      </w:r>
+    </w:p>
+    <w:p>
+      <w:pPr>
+        <w:pStyle w:val="ListParagraph"/>
+        <w:numPr>
+          <w:ilvl w:val="2"/>
+          <w:numId w:val="1"/>
+        </w:numPr>
+        <w:rPr/>
+      </w:pPr>
+      <w:r>
+        <w:rPr/>
+        <w:t>Jeduson</w:t>
+      </w:r>
+    </w:p>
+    <w:p>
+      <w:pPr>
+        <w:pStyle w:val="ListParagraph"/>
+        <w:numPr>
+          <w:ilvl w:val="1"/>
+          <w:numId w:val="1"/>
+        </w:numPr>
+        <w:rPr/>
+      </w:pPr>
+      <w:r>
+        <w:rPr/>
+        <w:t>Basic Camera Feed Display</w:t>
+      </w:r>
+    </w:p>
+    <w:p>
+      <w:pPr>
+        <w:pStyle w:val="ListParagraph"/>
+        <w:numPr>
+          <w:ilvl w:val="2"/>
+          <w:numId w:val="1"/>
+        </w:numPr>
+        <w:rPr/>
+      </w:pPr>
+      <w:r>
+        <w:rPr/>
+        <w:t>Ryan</w:t>
+      </w:r>
+    </w:p>
+    <w:p>
+      <w:pPr>
+        <w:pStyle w:val="ListParagraph"/>
+        <w:numPr>
+          <w:ilvl w:val="1"/>
+          <w:numId w:val="1"/>
+        </w:numPr>
+        <w:rPr/>
+      </w:pPr>
+      <w:r>
+        <w:rPr/>
+        <w:t>Basic GUI Setup</w:t>
+      </w:r>
+    </w:p>
+    <w:p>
+      <w:pPr>
+        <w:pStyle w:val="ListParagraph"/>
+        <w:numPr>
+          <w:ilvl w:val="2"/>
+          <w:numId w:val="1"/>
+        </w:numPr>
+        <w:rPr/>
+      </w:pPr>
+      <w:r>
+        <w:rPr/>
+        <w:t>Ryan</w:t>
+      </w:r>
+    </w:p>
+    <w:p>
+      <w:pPr>
+        <w:pStyle w:val="Normal"/>
+      </w:pPr>
+    </w:p>
+    <w:p>
+      <w:pPr>
+        <w:pStyle w:val="Heading2"/>
+      </w:pPr>
+      <w:bookmarkStart w:name="_Toc277381240" w:id="443603484"/>
       <w:r>
         <w:rPr/>
         <w:t>Customer meeting’s video summary</w:t>
       </w:r>
-      <w:bookmarkEnd w:id="1173891091"/>
+      <w:bookmarkEnd w:id="443603484"/>
     </w:p>
     <w:p>
       <w:r>
@@ -1150,6 +1511,126 @@
     </w:pPr>
   </w:p>
 </w:hdr>
+</file>
+
+<file path=word/numbering.xml><?xml version="1.0" encoding="utf-8"?>
+<w:numbering xmlns:w="http://schemas.openxmlformats.org/wordprocessingml/2006/main">
+  <w:abstractNum xmlns:w="http://schemas.openxmlformats.org/wordprocessingml/2006/main" w:abstractNumId="1">
+    <w:nsid w:val="357c0a54"/>
+    <w:multiLevelType xmlns:w="http://schemas.openxmlformats.org/wordprocessingml/2006/main" w:val="hybridMultilevel"/>
+    <w:lvl xmlns:w="http://schemas.openxmlformats.org/wordprocessingml/2006/main" w:ilvl="0">
+      <w:start w:val="1"/>
+      <w:numFmt w:val="bullet"/>
+      <w:lvlText w:val="-"/>
+      <w:lvlJc w:val="left"/>
+      <w:pPr>
+        <w:ind w:left="720" w:hanging="360"/>
+      </w:pPr>
+      <w:rPr>
+        <w:rFonts w:hint="default" w:ascii="Aptos" w:hAnsi="Aptos"/>
+      </w:rPr>
+    </w:lvl>
+    <w:lvl xmlns:w="http://schemas.openxmlformats.org/wordprocessingml/2006/main" w:ilvl="1">
+      <w:start w:val="1"/>
+      <w:numFmt w:val="bullet"/>
+      <w:lvlText w:val="o"/>
+      <w:lvlJc w:val="left"/>
+      <w:pPr>
+        <w:ind w:left="1440" w:hanging="360"/>
+      </w:pPr>
+      <w:rPr>
+        <w:rFonts w:hint="default" w:ascii="Courier New" w:hAnsi="Courier New"/>
+      </w:rPr>
+    </w:lvl>
+    <w:lvl xmlns:w="http://schemas.openxmlformats.org/wordprocessingml/2006/main" w:ilvl="2">
+      <w:start w:val="1"/>
+      <w:numFmt w:val="bullet"/>
+      <w:lvlText w:val=""/>
+      <w:lvlJc w:val="left"/>
+      <w:pPr>
+        <w:ind w:left="2160" w:hanging="360"/>
+      </w:pPr>
+      <w:rPr>
+        <w:rFonts w:hint="default" w:ascii="Wingdings" w:hAnsi="Wingdings"/>
+      </w:rPr>
+    </w:lvl>
+    <w:lvl xmlns:w="http://schemas.openxmlformats.org/wordprocessingml/2006/main" w:ilvl="3">
+      <w:start w:val="1"/>
+      <w:numFmt w:val="bullet"/>
+      <w:lvlText w:val=""/>
+      <w:lvlJc w:val="left"/>
+      <w:pPr>
+        <w:ind w:left="2880" w:hanging="360"/>
+      </w:pPr>
+      <w:rPr>
+        <w:rFonts w:hint="default" w:ascii="Symbol" w:hAnsi="Symbol"/>
+      </w:rPr>
+    </w:lvl>
+    <w:lvl xmlns:w="http://schemas.openxmlformats.org/wordprocessingml/2006/main" w:ilvl="4">
+      <w:start w:val="1"/>
+      <w:numFmt w:val="bullet"/>
+      <w:lvlText w:val="o"/>
+      <w:lvlJc w:val="left"/>
+      <w:pPr>
+        <w:ind w:left="3600" w:hanging="360"/>
+      </w:pPr>
+      <w:rPr>
+        <w:rFonts w:hint="default" w:ascii="Courier New" w:hAnsi="Courier New"/>
+      </w:rPr>
+    </w:lvl>
+    <w:lvl xmlns:w="http://schemas.openxmlformats.org/wordprocessingml/2006/main" w:ilvl="5">
+      <w:start w:val="1"/>
+      <w:numFmt w:val="bullet"/>
+      <w:lvlText w:val=""/>
+      <w:lvlJc w:val="left"/>
+      <w:pPr>
+        <w:ind w:left="4320" w:hanging="360"/>
+      </w:pPr>
+      <w:rPr>
+        <w:rFonts w:hint="default" w:ascii="Wingdings" w:hAnsi="Wingdings"/>
+      </w:rPr>
+    </w:lvl>
+    <w:lvl xmlns:w="http://schemas.openxmlformats.org/wordprocessingml/2006/main" w:ilvl="6">
+      <w:start w:val="1"/>
+      <w:numFmt w:val="bullet"/>
+      <w:lvlText w:val=""/>
+      <w:lvlJc w:val="left"/>
+      <w:pPr>
+        <w:ind w:left="5040" w:hanging="360"/>
+      </w:pPr>
+      <w:rPr>
+        <w:rFonts w:hint="default" w:ascii="Symbol" w:hAnsi="Symbol"/>
+      </w:rPr>
+    </w:lvl>
+    <w:lvl xmlns:w="http://schemas.openxmlformats.org/wordprocessingml/2006/main" w:ilvl="7">
+      <w:start w:val="1"/>
+      <w:numFmt w:val="bullet"/>
+      <w:lvlText w:val="o"/>
+      <w:lvlJc w:val="left"/>
+      <w:pPr>
+        <w:ind w:left="5760" w:hanging="360"/>
+      </w:pPr>
+      <w:rPr>
+        <w:rFonts w:hint="default" w:ascii="Courier New" w:hAnsi="Courier New"/>
+      </w:rPr>
+    </w:lvl>
+    <w:lvl xmlns:w="http://schemas.openxmlformats.org/wordprocessingml/2006/main" w:ilvl="8">
+      <w:start w:val="1"/>
+      <w:numFmt w:val="bullet"/>
+      <w:lvlText w:val=""/>
+      <w:lvlJc w:val="left"/>
+      <w:pPr>
+        <w:ind w:left="6480" w:hanging="360"/>
+      </w:pPr>
+      <w:rPr>
+        <w:rFonts w:hint="default" w:ascii="Wingdings" w:hAnsi="Wingdings"/>
+      </w:rPr>
+    </w:lvl>
+  </w:abstractNum>
+  <w:num w:numId="1">
+    <w:abstractNumId w:val="1"/>
+  </w:num>
+</w:numbering>
 </file>
 
 <file path=word/styles.xml><?xml version="1.0" encoding="utf-8"?>

</xml_diff>